<commit_message>
Backen/Datenbank so gut wie fertig. Frontend angefangen
</commit_message>
<xml_diff>
--- a/Konzeptdokument.docx
+++ b/Konzeptdokument.docx
@@ -95,18 +95,12 @@
     <w:p/>
     <w:p>
       <w:pPr>
-        <w:rPr>
-          <w:b/>
-          <w:bCs/>
-        </w:rPr>
-      </w:pPr>
-      <w:r>
-        <w:rPr>
-          <w:b/>
-          <w:bCs/>
-        </w:rPr>
-        <w:t xml:space="preserve">2. </w:t>
-      </w:r>
+        <w:ind w:firstLine="360"/>
+        <w:rPr>
+          <w:b/>
+          <w:bCs/>
+        </w:rPr>
+      </w:pPr>
       <w:r>
         <w:rPr>
           <w:b/>
@@ -182,7 +176,13 @@
         <w:t>Datensynchronisation:</w:t>
       </w:r>
       <w:r>
-        <w:t xml:space="preserve"> Speicherung der Daten in einer MySQL-Datenbank via REST-API.</w:t>
+        <w:t xml:space="preserve"> Speicherung der Daten in einer MySQL-Datenbank</w:t>
+      </w:r>
+      <w:r>
+        <w:t xml:space="preserve"> (SQLite)</w:t>
+      </w:r>
+      <w:r>
+        <w:t xml:space="preserve"> via REST-API.</w:t>
       </w:r>
     </w:p>
     <w:p>
@@ -203,25 +203,35 @@
         <w:t xml:space="preserve"> Grafische Auswertung der Ausgaben nach Kategorien.</w:t>
       </w:r>
     </w:p>
-    <w:p/>
     <w:p>
-      <w:pPr>
-        <w:rPr>
-          <w:b/>
-          <w:bCs/>
-        </w:rPr>
-      </w:pPr>
-      <w:r>
-        <w:rPr>
-          <w:b/>
-          <w:bCs/>
-        </w:rPr>
-        <w:t>3</w:t>
-      </w:r>
-      <w:r>
-        <w:rPr>
-          <w:b/>
-          <w:bCs/>
+      <w:r>
+        <w:t xml:space="preserve"> </w:t>
+      </w:r>
+    </w:p>
+    <w:p>
+      <w:pPr>
+        <w:rPr>
+          <w:b/>
+          <w:bCs/>
+          <w:sz w:val="24"/>
+          <w:szCs w:val="24"/>
+        </w:rPr>
+      </w:pPr>
+      <w:r>
+        <w:rPr>
+          <w:b/>
+          <w:bCs/>
+          <w:sz w:val="24"/>
+          <w:szCs w:val="24"/>
+        </w:rPr>
+        <w:t>2</w:t>
+      </w:r>
+      <w:r>
+        <w:rPr>
+          <w:b/>
+          <w:bCs/>
+          <w:sz w:val="24"/>
+          <w:szCs w:val="24"/>
         </w:rPr>
         <w:t>. Technische Anforderungen</w:t>
       </w:r>
@@ -374,44 +384,75 @@
         <w:rPr>
           <w:b/>
           <w:bCs/>
-        </w:rPr>
-      </w:pPr>
-      <w:r>
-        <w:rPr>
-          <w:b/>
-          <w:bCs/>
-        </w:rPr>
-        <w:t>4</w:t>
-      </w:r>
-      <w:r>
-        <w:rPr>
-          <w:b/>
-          <w:bCs/>
-        </w:rPr>
-        <w:t xml:space="preserve">. </w:t>
-      </w:r>
-      <w:r>
-        <w:rPr>
-          <w:b/>
-          <w:bCs/>
-        </w:rPr>
-        <w:t>Mockups</w:t>
+          <w:sz w:val="24"/>
+          <w:szCs w:val="24"/>
+        </w:rPr>
+      </w:pPr>
+      <w:r>
+        <w:rPr>
+          <w:b/>
+          <w:bCs/>
+          <w:sz w:val="24"/>
+          <w:szCs w:val="24"/>
+        </w:rPr>
+        <w:t>3</w:t>
+      </w:r>
+      <w:r>
+        <w:rPr>
+          <w:b/>
+          <w:bCs/>
+          <w:sz w:val="24"/>
+          <w:szCs w:val="24"/>
+        </w:rPr>
+        <w:t>. Mockups</w:t>
+      </w:r>
+      <w:r>
+        <w:rPr>
+          <w:b/>
+          <w:bCs/>
+          <w:sz w:val="24"/>
+          <w:szCs w:val="24"/>
+        </w:rPr>
+        <w:t xml:space="preserve"> (mit </w:t>
+      </w:r>
+      <w:proofErr w:type="spellStart"/>
+      <w:r>
+        <w:rPr>
+          <w:b/>
+          <w:bCs/>
+          <w:sz w:val="24"/>
+          <w:szCs w:val="24"/>
+        </w:rPr>
+        <w:t>balsamiq</w:t>
+      </w:r>
+      <w:proofErr w:type="spellEnd"/>
+      <w:r>
+        <w:rPr>
+          <w:b/>
+          <w:bCs/>
+          <w:sz w:val="24"/>
+          <w:szCs w:val="24"/>
+        </w:rPr>
+        <w:t>)</w:t>
       </w:r>
     </w:p>
     <w:p/>
     <w:p>
       <w:r>
+        <w:rPr>
+          <w:noProof/>
+        </w:rPr>
         <w:drawing>
-          <wp:anchor distT="0" distB="0" distL="114300" distR="114300" simplePos="0" relativeHeight="251659264" behindDoc="0" locked="0" layoutInCell="1" allowOverlap="1" wp14:anchorId="6EC2FDE9" wp14:editId="5DF260C3">
+          <wp:anchor distT="0" distB="0" distL="114300" distR="114300" simplePos="0" relativeHeight="251659264" behindDoc="0" locked="0" layoutInCell="1" allowOverlap="1" wp14:anchorId="6EC2FDE9" wp14:editId="5FE3F376">
             <wp:simplePos x="0" y="0"/>
             <wp:positionH relativeFrom="margin">
-              <wp:posOffset>1358496</wp:posOffset>
+              <wp:posOffset>2036445</wp:posOffset>
             </wp:positionH>
             <wp:positionV relativeFrom="paragraph">
-              <wp:posOffset>275127</wp:posOffset>
+              <wp:posOffset>267335</wp:posOffset>
             </wp:positionV>
-            <wp:extent cx="1588043" cy="2944091"/>
-            <wp:effectExtent l="0" t="0" r="0" b="0"/>
+            <wp:extent cx="1611303" cy="2988000"/>
+            <wp:effectExtent l="0" t="0" r="8255" b="3175"/>
             <wp:wrapNone/>
             <wp:docPr id="1839327711" name="Grafik 1" descr="Ein Bild, das Text, Screenshot, Software, Design enthält.&#10;&#10;KI-generierte Inhalte können fehlerhaft sein."/>
             <wp:cNvGraphicFramePr>
@@ -439,7 +480,7 @@
                   <pic:spPr>
                     <a:xfrm>
                       <a:off x="0" y="0"/>
-                      <a:ext cx="1590057" cy="2947824"/>
+                      <a:ext cx="1611303" cy="2988000"/>
                     </a:xfrm>
                     <a:prstGeom prst="rect">
                       <a:avLst/>
@@ -458,19 +499,22 @@
         </w:drawing>
       </w:r>
       <w:r>
+        <w:rPr>
+          <w:noProof/>
+        </w:rPr>
         <w:drawing>
-          <wp:anchor distT="0" distB="0" distL="114300" distR="114300" simplePos="0" relativeHeight="251658240" behindDoc="0" locked="0" layoutInCell="1" allowOverlap="1" wp14:anchorId="5B6F8743" wp14:editId="6DF45072">
+          <wp:anchor distT="0" distB="0" distL="114300" distR="114300" simplePos="0" relativeHeight="251660288" behindDoc="0" locked="0" layoutInCell="1" allowOverlap="1" wp14:anchorId="7D278483" wp14:editId="07AB5E95">
             <wp:simplePos x="0" y="0"/>
-            <wp:positionH relativeFrom="margin">
-              <wp:posOffset>-381635</wp:posOffset>
+            <wp:positionH relativeFrom="column">
+              <wp:posOffset>4525645</wp:posOffset>
             </wp:positionH>
             <wp:positionV relativeFrom="paragraph">
-              <wp:posOffset>257810</wp:posOffset>
+              <wp:posOffset>239395</wp:posOffset>
             </wp:positionV>
-            <wp:extent cx="1485900" cy="2977515"/>
-            <wp:effectExtent l="0" t="0" r="0" b="0"/>
+            <wp:extent cx="1580024" cy="2988000"/>
+            <wp:effectExtent l="0" t="0" r="1270" b="3175"/>
             <wp:wrapNone/>
-            <wp:docPr id="2093876954" name="Grafik 1" descr="Ein Bild, das Text, Screenshot, Schrift, Design enthält.&#10;&#10;KI-generierte Inhalte können fehlerhaft sein."/>
+            <wp:docPr id="167310624" name="Grafik 1" descr="Ein Bild, das Text, Screenshot, Schrift, Design enthält.&#10;&#10;KI-generierte Inhalte können fehlerhaft sein."/>
             <wp:cNvGraphicFramePr>
               <a:graphicFrameLocks xmlns:a="http://schemas.openxmlformats.org/drawingml/2006/main" noChangeAspect="1"/>
             </wp:cNvGraphicFramePr>
@@ -478,7 +522,7 @@
               <a:graphicData uri="http://schemas.openxmlformats.org/drawingml/2006/picture">
                 <pic:pic xmlns:pic="http://schemas.openxmlformats.org/drawingml/2006/picture">
                   <pic:nvPicPr>
-                    <pic:cNvPr id="2093876954" name="Grafik 1" descr="Ein Bild, das Text, Screenshot, Schrift, Design enthält.&#10;&#10;KI-generierte Inhalte können fehlerhaft sein."/>
+                    <pic:cNvPr id="167310624" name="Grafik 1" descr="Ein Bild, das Text, Screenshot, Schrift, Design enthält.&#10;&#10;KI-generierte Inhalte können fehlerhaft sein."/>
                     <pic:cNvPicPr/>
                   </pic:nvPicPr>
                   <pic:blipFill>
@@ -496,7 +540,7 @@
                   <pic:spPr>
                     <a:xfrm>
                       <a:off x="0" y="0"/>
-                      <a:ext cx="1485900" cy="2977515"/>
+                      <a:ext cx="1580024" cy="2988000"/>
                     </a:xfrm>
                     <a:prstGeom prst="rect">
                       <a:avLst/>
@@ -515,6 +559,66 @@
         </w:drawing>
       </w:r>
       <w:r>
+        <w:rPr>
+          <w:noProof/>
+        </w:rPr>
+        <w:drawing>
+          <wp:anchor distT="0" distB="0" distL="114300" distR="114300" simplePos="0" relativeHeight="251658240" behindDoc="0" locked="0" layoutInCell="1" allowOverlap="1" wp14:anchorId="5B6F8743" wp14:editId="47F94A7B">
+            <wp:simplePos x="0" y="0"/>
+            <wp:positionH relativeFrom="margin">
+              <wp:posOffset>-389255</wp:posOffset>
+            </wp:positionH>
+            <wp:positionV relativeFrom="paragraph">
+              <wp:posOffset>257810</wp:posOffset>
+            </wp:positionV>
+            <wp:extent cx="1491132" cy="2988000"/>
+            <wp:effectExtent l="0" t="0" r="0" b="3175"/>
+            <wp:wrapNone/>
+            <wp:docPr id="2093876954" name="Grafik 1" descr="Ein Bild, das Text, Screenshot, Schrift, Design enthält.&#10;&#10;KI-generierte Inhalte können fehlerhaft sein."/>
+            <wp:cNvGraphicFramePr>
+              <a:graphicFrameLocks xmlns:a="http://schemas.openxmlformats.org/drawingml/2006/main" noChangeAspect="1"/>
+            </wp:cNvGraphicFramePr>
+            <a:graphic xmlns:a="http://schemas.openxmlformats.org/drawingml/2006/main">
+              <a:graphicData uri="http://schemas.openxmlformats.org/drawingml/2006/picture">
+                <pic:pic xmlns:pic="http://schemas.openxmlformats.org/drawingml/2006/picture">
+                  <pic:nvPicPr>
+                    <pic:cNvPr id="2093876954" name="Grafik 1" descr="Ein Bild, das Text, Screenshot, Schrift, Design enthält.&#10;&#10;KI-generierte Inhalte können fehlerhaft sein."/>
+                    <pic:cNvPicPr/>
+                  </pic:nvPicPr>
+                  <pic:blipFill>
+                    <a:blip r:embed="rId7">
+                      <a:extLst>
+                        <a:ext uri="{28A0092B-C50C-407E-A947-70E740481C1C}">
+                          <a14:useLocalDpi xmlns:a14="http://schemas.microsoft.com/office/drawing/2010/main" val="0"/>
+                        </a:ext>
+                      </a:extLst>
+                    </a:blip>
+                    <a:stretch>
+                      <a:fillRect/>
+                    </a:stretch>
+                  </pic:blipFill>
+                  <pic:spPr>
+                    <a:xfrm>
+                      <a:off x="0" y="0"/>
+                      <a:ext cx="1491132" cy="2988000"/>
+                    </a:xfrm>
+                    <a:prstGeom prst="rect">
+                      <a:avLst/>
+                    </a:prstGeom>
+                  </pic:spPr>
+                </pic:pic>
+              </a:graphicData>
+            </a:graphic>
+            <wp14:sizeRelH relativeFrom="margin">
+              <wp14:pctWidth>0</wp14:pctWidth>
+            </wp14:sizeRelH>
+            <wp14:sizeRelV relativeFrom="margin">
+              <wp14:pctHeight>0</wp14:pctHeight>
+            </wp14:sizeRelV>
+          </wp:anchor>
+        </w:drawing>
+      </w:r>
+      <w:r>
         <w:t>Dashboard</w:t>
       </w:r>
       <w:r>
@@ -527,7 +631,918 @@
         <w:tab/>
       </w:r>
       <w:r>
+        <w:tab/>
+        <w:t xml:space="preserve">          </w:t>
+      </w:r>
+      <w:r>
         <w:t>Abo- Liste</w:t>
+      </w:r>
+      <w:r>
+        <w:tab/>
+      </w:r>
+      <w:r>
+        <w:tab/>
+      </w:r>
+      <w:r>
+        <w:tab/>
+      </w:r>
+      <w:r>
+        <w:tab/>
+        <w:t xml:space="preserve">                   Add/Edit</w:t>
+      </w:r>
+    </w:p>
+    <w:p>
+      <w:r>
+        <w:br w:type="page"/>
+      </w:r>
+    </w:p>
+    <w:p>
+      <w:pPr>
+        <w:ind w:left="708" w:firstLine="708"/>
+      </w:pPr>
+      <w:r>
+        <w:lastRenderedPageBreak/>
+        <w:t>Analytics</w:t>
+      </w:r>
+      <w:r>
+        <w:tab/>
+      </w:r>
+      <w:r>
+        <w:tab/>
+      </w:r>
+      <w:r>
+        <w:tab/>
+      </w:r>
+      <w:r>
+        <w:tab/>
+      </w:r>
+      <w:r>
+        <w:tab/>
+      </w:r>
+      <w:r>
+        <w:tab/>
+      </w:r>
+      <w:r>
+        <w:t>Einstellungen</w:t>
+      </w:r>
+    </w:p>
+    <w:p>
+      <w:r>
+        <w:rPr>
+          <w:noProof/>
+        </w:rPr>
+        <w:drawing>
+          <wp:anchor distT="0" distB="0" distL="114300" distR="114300" simplePos="0" relativeHeight="251662336" behindDoc="0" locked="0" layoutInCell="1" allowOverlap="1" wp14:anchorId="536A3459" wp14:editId="03A6E32D">
+            <wp:simplePos x="0" y="0"/>
+            <wp:positionH relativeFrom="column">
+              <wp:posOffset>3618865</wp:posOffset>
+            </wp:positionH>
+            <wp:positionV relativeFrom="paragraph">
+              <wp:posOffset>10160</wp:posOffset>
+            </wp:positionV>
+            <wp:extent cx="1591945" cy="2987675"/>
+            <wp:effectExtent l="0" t="0" r="8255" b="3175"/>
+            <wp:wrapNone/>
+            <wp:docPr id="491166658" name="Grafik 1" descr="Ein Bild, das Text, Screenshot, Software, Design enthält.&#10;&#10;KI-generierte Inhalte können fehlerhaft sein."/>
+            <wp:cNvGraphicFramePr>
+              <a:graphicFrameLocks xmlns:a="http://schemas.openxmlformats.org/drawingml/2006/main" noChangeAspect="1"/>
+            </wp:cNvGraphicFramePr>
+            <a:graphic xmlns:a="http://schemas.openxmlformats.org/drawingml/2006/main">
+              <a:graphicData uri="http://schemas.openxmlformats.org/drawingml/2006/picture">
+                <pic:pic xmlns:pic="http://schemas.openxmlformats.org/drawingml/2006/picture">
+                  <pic:nvPicPr>
+                    <pic:cNvPr id="491166658" name="Grafik 1" descr="Ein Bild, das Text, Screenshot, Software, Design enthält.&#10;&#10;KI-generierte Inhalte können fehlerhaft sein."/>
+                    <pic:cNvPicPr/>
+                  </pic:nvPicPr>
+                  <pic:blipFill>
+                    <a:blip r:embed="rId8">
+                      <a:extLst>
+                        <a:ext uri="{28A0092B-C50C-407E-A947-70E740481C1C}">
+                          <a14:useLocalDpi xmlns:a14="http://schemas.microsoft.com/office/drawing/2010/main" val="0"/>
+                        </a:ext>
+                      </a:extLst>
+                    </a:blip>
+                    <a:stretch>
+                      <a:fillRect/>
+                    </a:stretch>
+                  </pic:blipFill>
+                  <pic:spPr>
+                    <a:xfrm>
+                      <a:off x="0" y="0"/>
+                      <a:ext cx="1591945" cy="2987675"/>
+                    </a:xfrm>
+                    <a:prstGeom prst="rect">
+                      <a:avLst/>
+                    </a:prstGeom>
+                  </pic:spPr>
+                </pic:pic>
+              </a:graphicData>
+            </a:graphic>
+            <wp14:sizeRelH relativeFrom="margin">
+              <wp14:pctWidth>0</wp14:pctWidth>
+            </wp14:sizeRelH>
+            <wp14:sizeRelV relativeFrom="margin">
+              <wp14:pctHeight>0</wp14:pctHeight>
+            </wp14:sizeRelV>
+          </wp:anchor>
+        </w:drawing>
+      </w:r>
+      <w:r>
+        <w:rPr>
+          <w:noProof/>
+        </w:rPr>
+        <w:drawing>
+          <wp:anchor distT="0" distB="0" distL="114300" distR="114300" simplePos="0" relativeHeight="251661312" behindDoc="0" locked="0" layoutInCell="1" allowOverlap="1" wp14:anchorId="18F50F79" wp14:editId="504CECA7">
+            <wp:simplePos x="0" y="0"/>
+            <wp:positionH relativeFrom="margin">
+              <wp:posOffset>349885</wp:posOffset>
+            </wp:positionH>
+            <wp:positionV relativeFrom="paragraph">
+              <wp:posOffset>33020</wp:posOffset>
+            </wp:positionV>
+            <wp:extent cx="1607480" cy="2988000"/>
+            <wp:effectExtent l="0" t="0" r="0" b="3175"/>
+            <wp:wrapNone/>
+            <wp:docPr id="1705019849" name="Grafik 1" descr="Ein Bild, das Screenshot, Text, Uhr, Kreis enthält.&#10;&#10;KI-generierte Inhalte können fehlerhaft sein."/>
+            <wp:cNvGraphicFramePr>
+              <a:graphicFrameLocks xmlns:a="http://schemas.openxmlformats.org/drawingml/2006/main" noChangeAspect="1"/>
+            </wp:cNvGraphicFramePr>
+            <a:graphic xmlns:a="http://schemas.openxmlformats.org/drawingml/2006/main">
+              <a:graphicData uri="http://schemas.openxmlformats.org/drawingml/2006/picture">
+                <pic:pic xmlns:pic="http://schemas.openxmlformats.org/drawingml/2006/picture">
+                  <pic:nvPicPr>
+                    <pic:cNvPr id="1705019849" name="Grafik 1" descr="Ein Bild, das Screenshot, Text, Uhr, Kreis enthält.&#10;&#10;KI-generierte Inhalte können fehlerhaft sein."/>
+                    <pic:cNvPicPr/>
+                  </pic:nvPicPr>
+                  <pic:blipFill>
+                    <a:blip r:embed="rId9">
+                      <a:extLst>
+                        <a:ext uri="{28A0092B-C50C-407E-A947-70E740481C1C}">
+                          <a14:useLocalDpi xmlns:a14="http://schemas.microsoft.com/office/drawing/2010/main" val="0"/>
+                        </a:ext>
+                      </a:extLst>
+                    </a:blip>
+                    <a:stretch>
+                      <a:fillRect/>
+                    </a:stretch>
+                  </pic:blipFill>
+                  <pic:spPr>
+                    <a:xfrm>
+                      <a:off x="0" y="0"/>
+                      <a:ext cx="1607480" cy="2988000"/>
+                    </a:xfrm>
+                    <a:prstGeom prst="rect">
+                      <a:avLst/>
+                    </a:prstGeom>
+                  </pic:spPr>
+                </pic:pic>
+              </a:graphicData>
+            </a:graphic>
+            <wp14:sizeRelH relativeFrom="margin">
+              <wp14:pctWidth>0</wp14:pctWidth>
+            </wp14:sizeRelH>
+            <wp14:sizeRelV relativeFrom="margin">
+              <wp14:pctHeight>0</wp14:pctHeight>
+            </wp14:sizeRelV>
+          </wp:anchor>
+        </w:drawing>
+      </w:r>
+    </w:p>
+    <w:p/>
+    <w:p/>
+    <w:p/>
+    <w:p/>
+    <w:p/>
+    <w:p/>
+    <w:p/>
+    <w:p/>
+    <w:p/>
+    <w:p/>
+    <w:p/>
+    <w:p>
+      <w:pPr>
+        <w:rPr>
+          <w:b/>
+          <w:bCs/>
+          <w:sz w:val="24"/>
+          <w:szCs w:val="24"/>
+        </w:rPr>
+      </w:pPr>
+      <w:r>
+        <w:rPr>
+          <w:b/>
+          <w:bCs/>
+          <w:sz w:val="24"/>
+          <w:szCs w:val="24"/>
+        </w:rPr>
+        <w:t>4</w:t>
+      </w:r>
+      <w:r>
+        <w:rPr>
+          <w:b/>
+          <w:bCs/>
+          <w:sz w:val="24"/>
+          <w:szCs w:val="24"/>
+        </w:rPr>
+        <w:t xml:space="preserve">. Meilenstein Plan </w:t>
+      </w:r>
+    </w:p>
+    <w:p>
+      <w:pPr>
+        <w:rPr>
+          <w:b/>
+          <w:bCs/>
+        </w:rPr>
+      </w:pPr>
+    </w:p>
+    <w:tbl>
+      <w:tblPr>
+        <w:tblW w:w="9767" w:type="dxa"/>
+        <w:tblCellSpacing w:w="15" w:type="dxa"/>
+        <w:tblInd w:w="-342" w:type="dxa"/>
+        <w:tblBorders>
+          <w:insideH w:val="single" w:sz="4" w:space="0" w:color="auto"/>
+          <w:insideV w:val="single" w:sz="4" w:space="0" w:color="auto"/>
+        </w:tblBorders>
+        <w:tblCellMar>
+          <w:left w:w="0" w:type="dxa"/>
+          <w:right w:w="0" w:type="dxa"/>
+        </w:tblCellMar>
+        <w:tblLook w:val="04A0" w:firstRow="1" w:lastRow="0" w:firstColumn="1" w:lastColumn="0" w:noHBand="0" w:noVBand="1"/>
+      </w:tblPr>
+      <w:tblGrid>
+        <w:gridCol w:w="1883"/>
+        <w:gridCol w:w="5172"/>
+        <w:gridCol w:w="2712"/>
+      </w:tblGrid>
+      <w:tr>
+        <w:trPr>
+          <w:trHeight w:val="447"/>
+          <w:tblHeader/>
+          <w:tblCellSpacing w:w="15" w:type="dxa"/>
+        </w:trPr>
+        <w:tc>
+          <w:tcPr>
+            <w:tcW w:w="0" w:type="auto"/>
+            <w:tcMar>
+              <w:top w:w="120" w:type="dxa"/>
+              <w:left w:w="180" w:type="dxa"/>
+              <w:bottom w:w="120" w:type="dxa"/>
+              <w:right w:w="180" w:type="dxa"/>
+            </w:tcMar>
+            <w:vAlign w:val="center"/>
+            <w:hideMark/>
+          </w:tcPr>
+          <w:p>
+            <w:r>
+              <w:rPr>
+                <w:b/>
+                <w:bCs/>
+              </w:rPr>
+              <w:t>Meilenstein</w:t>
+            </w:r>
+          </w:p>
+        </w:tc>
+        <w:tc>
+          <w:tcPr>
+            <w:tcW w:w="0" w:type="auto"/>
+            <w:tcMar>
+              <w:top w:w="120" w:type="dxa"/>
+              <w:left w:w="180" w:type="dxa"/>
+              <w:bottom w:w="120" w:type="dxa"/>
+              <w:right w:w="180" w:type="dxa"/>
+            </w:tcMar>
+            <w:vAlign w:val="center"/>
+            <w:hideMark/>
+          </w:tcPr>
+          <w:p>
+            <w:r>
+              <w:rPr>
+                <w:b/>
+                <w:bCs/>
+              </w:rPr>
+              <w:t>Funktionalität</w:t>
+            </w:r>
+          </w:p>
+        </w:tc>
+        <w:tc>
+          <w:tcPr>
+            <w:tcW w:w="0" w:type="auto"/>
+            <w:tcMar>
+              <w:top w:w="120" w:type="dxa"/>
+              <w:left w:w="180" w:type="dxa"/>
+              <w:bottom w:w="120" w:type="dxa"/>
+              <w:right w:w="180" w:type="dxa"/>
+            </w:tcMar>
+            <w:vAlign w:val="center"/>
+            <w:hideMark/>
+          </w:tcPr>
+          <w:p>
+            <w:r>
+              <w:rPr>
+                <w:b/>
+                <w:bCs/>
+              </w:rPr>
+              <w:t>Geplante Deadline</w:t>
+            </w:r>
+          </w:p>
+        </w:tc>
+      </w:tr>
+      <w:tr>
+        <w:trPr>
+          <w:trHeight w:val="459"/>
+          <w:tblCellSpacing w:w="15" w:type="dxa"/>
+        </w:trPr>
+        <w:tc>
+          <w:tcPr>
+            <w:tcW w:w="0" w:type="auto"/>
+            <w:tcMar>
+              <w:top w:w="120" w:type="dxa"/>
+              <w:left w:w="180" w:type="dxa"/>
+              <w:bottom w:w="120" w:type="dxa"/>
+              <w:right w:w="180" w:type="dxa"/>
+            </w:tcMar>
+            <w:vAlign w:val="center"/>
+            <w:hideMark/>
+          </w:tcPr>
+          <w:p>
+            <w:r>
+              <w:rPr>
+                <w:b/>
+                <w:bCs/>
+              </w:rPr>
+              <w:t>M1</w:t>
+            </w:r>
+          </w:p>
+        </w:tc>
+        <w:tc>
+          <w:tcPr>
+            <w:tcW w:w="0" w:type="auto"/>
+            <w:tcMar>
+              <w:top w:w="120" w:type="dxa"/>
+              <w:left w:w="180" w:type="dxa"/>
+              <w:bottom w:w="120" w:type="dxa"/>
+              <w:right w:w="180" w:type="dxa"/>
+            </w:tcMar>
+            <w:vAlign w:val="center"/>
+            <w:hideMark/>
+          </w:tcPr>
+          <w:p>
+            <w:r>
+              <w:t>Backend-API &amp; DB-Schema</w:t>
+            </w:r>
+          </w:p>
+        </w:tc>
+        <w:tc>
+          <w:tcPr>
+            <w:tcW w:w="0" w:type="auto"/>
+            <w:tcMar>
+              <w:top w:w="120" w:type="dxa"/>
+              <w:left w:w="180" w:type="dxa"/>
+              <w:bottom w:w="120" w:type="dxa"/>
+              <w:right w:w="180" w:type="dxa"/>
+            </w:tcMar>
+            <w:vAlign w:val="center"/>
+            <w:hideMark/>
+          </w:tcPr>
+          <w:p>
+            <w:r>
+              <w:t>24</w:t>
+            </w:r>
+            <w:r>
+              <w:t>.02.2026</w:t>
+            </w:r>
+          </w:p>
+        </w:tc>
+      </w:tr>
+      <w:tr>
+        <w:trPr>
+          <w:trHeight w:val="447"/>
+          <w:tblCellSpacing w:w="15" w:type="dxa"/>
+        </w:trPr>
+        <w:tc>
+          <w:tcPr>
+            <w:tcW w:w="0" w:type="auto"/>
+            <w:tcMar>
+              <w:top w:w="120" w:type="dxa"/>
+              <w:left w:w="180" w:type="dxa"/>
+              <w:bottom w:w="120" w:type="dxa"/>
+              <w:right w:w="180" w:type="dxa"/>
+            </w:tcMar>
+            <w:vAlign w:val="center"/>
+            <w:hideMark/>
+          </w:tcPr>
+          <w:p>
+            <w:r>
+              <w:rPr>
+                <w:b/>
+                <w:bCs/>
+              </w:rPr>
+              <w:t>M2</w:t>
+            </w:r>
+          </w:p>
+        </w:tc>
+        <w:tc>
+          <w:tcPr>
+            <w:tcW w:w="0" w:type="auto"/>
+            <w:tcMar>
+              <w:top w:w="120" w:type="dxa"/>
+              <w:left w:w="180" w:type="dxa"/>
+              <w:bottom w:w="120" w:type="dxa"/>
+              <w:right w:w="180" w:type="dxa"/>
+            </w:tcMar>
+            <w:vAlign w:val="center"/>
+            <w:hideMark/>
+          </w:tcPr>
+          <w:p>
+            <w:r>
+              <w:t>Flutter-Grundgerüst &amp; Navigation</w:t>
+            </w:r>
+          </w:p>
+        </w:tc>
+        <w:tc>
+          <w:tcPr>
+            <w:tcW w:w="0" w:type="auto"/>
+            <w:tcMar>
+              <w:top w:w="120" w:type="dxa"/>
+              <w:left w:w="180" w:type="dxa"/>
+              <w:bottom w:w="120" w:type="dxa"/>
+              <w:right w:w="180" w:type="dxa"/>
+            </w:tcMar>
+            <w:vAlign w:val="center"/>
+            <w:hideMark/>
+          </w:tcPr>
+          <w:p>
+            <w:r>
+              <w:t>03</w:t>
+            </w:r>
+            <w:r>
+              <w:t>.0</w:t>
+            </w:r>
+            <w:r>
+              <w:t>3</w:t>
+            </w:r>
+            <w:r>
+              <w:t>.2026</w:t>
+            </w:r>
+          </w:p>
+        </w:tc>
+      </w:tr>
+      <w:tr>
+        <w:trPr>
+          <w:trHeight w:val="459"/>
+          <w:tblCellSpacing w:w="15" w:type="dxa"/>
+        </w:trPr>
+        <w:tc>
+          <w:tcPr>
+            <w:tcW w:w="0" w:type="auto"/>
+            <w:tcMar>
+              <w:top w:w="120" w:type="dxa"/>
+              <w:left w:w="180" w:type="dxa"/>
+              <w:bottom w:w="120" w:type="dxa"/>
+              <w:right w:w="180" w:type="dxa"/>
+            </w:tcMar>
+            <w:vAlign w:val="center"/>
+            <w:hideMark/>
+          </w:tcPr>
+          <w:p>
+            <w:r>
+              <w:rPr>
+                <w:b/>
+                <w:bCs/>
+              </w:rPr>
+              <w:t>M3</w:t>
+            </w:r>
+          </w:p>
+        </w:tc>
+        <w:tc>
+          <w:tcPr>
+            <w:tcW w:w="0" w:type="auto"/>
+            <w:tcMar>
+              <w:top w:w="120" w:type="dxa"/>
+              <w:left w:w="180" w:type="dxa"/>
+              <w:bottom w:w="120" w:type="dxa"/>
+              <w:right w:w="180" w:type="dxa"/>
+            </w:tcMar>
+            <w:vAlign w:val="center"/>
+            <w:hideMark/>
+          </w:tcPr>
+          <w:p>
+            <w:r>
+              <w:t>REST-API Anbindung &amp; State Management</w:t>
+            </w:r>
+          </w:p>
+        </w:tc>
+        <w:tc>
+          <w:tcPr>
+            <w:tcW w:w="0" w:type="auto"/>
+            <w:tcMar>
+              <w:top w:w="120" w:type="dxa"/>
+              <w:left w:w="180" w:type="dxa"/>
+              <w:bottom w:w="120" w:type="dxa"/>
+              <w:right w:w="180" w:type="dxa"/>
+            </w:tcMar>
+            <w:vAlign w:val="center"/>
+            <w:hideMark/>
+          </w:tcPr>
+          <w:p>
+            <w:r>
+              <w:t>03</w:t>
+            </w:r>
+            <w:r>
+              <w:t>.0</w:t>
+            </w:r>
+            <w:r>
+              <w:t>3</w:t>
+            </w:r>
+            <w:r>
+              <w:t>.2026</w:t>
+            </w:r>
+          </w:p>
+        </w:tc>
+      </w:tr>
+      <w:tr>
+        <w:trPr>
+          <w:trHeight w:val="459"/>
+          <w:tblCellSpacing w:w="15" w:type="dxa"/>
+        </w:trPr>
+        <w:tc>
+          <w:tcPr>
+            <w:tcW w:w="0" w:type="auto"/>
+            <w:tcMar>
+              <w:top w:w="120" w:type="dxa"/>
+              <w:left w:w="180" w:type="dxa"/>
+              <w:bottom w:w="120" w:type="dxa"/>
+              <w:right w:w="180" w:type="dxa"/>
+            </w:tcMar>
+            <w:vAlign w:val="center"/>
+            <w:hideMark/>
+          </w:tcPr>
+          <w:p>
+            <w:r>
+              <w:rPr>
+                <w:b/>
+                <w:bCs/>
+              </w:rPr>
+              <w:t>M4</w:t>
+            </w:r>
+          </w:p>
+        </w:tc>
+        <w:tc>
+          <w:tcPr>
+            <w:tcW w:w="0" w:type="auto"/>
+            <w:tcMar>
+              <w:top w:w="120" w:type="dxa"/>
+              <w:left w:w="180" w:type="dxa"/>
+              <w:bottom w:w="120" w:type="dxa"/>
+              <w:right w:w="180" w:type="dxa"/>
+            </w:tcMar>
+            <w:vAlign w:val="center"/>
+            <w:hideMark/>
+          </w:tcPr>
+          <w:p>
+            <w:r>
+              <w:t xml:space="preserve">5 </w:t>
+            </w:r>
+            <w:proofErr w:type="spellStart"/>
+            <w:r>
+              <w:t>Themes</w:t>
+            </w:r>
+            <w:proofErr w:type="spellEnd"/>
+            <w:r>
+              <w:t xml:space="preserve"> &amp; </w:t>
+            </w:r>
+            <w:proofErr w:type="spellStart"/>
+            <w:r>
+              <w:t>Shared</w:t>
+            </w:r>
+            <w:proofErr w:type="spellEnd"/>
+            <w:r>
+              <w:t xml:space="preserve"> </w:t>
+            </w:r>
+            <w:proofErr w:type="spellStart"/>
+            <w:r>
+              <w:t>Preferences</w:t>
+            </w:r>
+            <w:proofErr w:type="spellEnd"/>
+            <w:r>
+              <w:t xml:space="preserve"> </w:t>
+            </w:r>
+          </w:p>
+        </w:tc>
+        <w:tc>
+          <w:tcPr>
+            <w:tcW w:w="0" w:type="auto"/>
+            <w:tcMar>
+              <w:top w:w="120" w:type="dxa"/>
+              <w:left w:w="180" w:type="dxa"/>
+              <w:bottom w:w="120" w:type="dxa"/>
+              <w:right w:w="180" w:type="dxa"/>
+            </w:tcMar>
+            <w:vAlign w:val="center"/>
+            <w:hideMark/>
+          </w:tcPr>
+          <w:p>
+            <w:r>
+              <w:t>10</w:t>
+            </w:r>
+            <w:r>
+              <w:t>.03.2026</w:t>
+            </w:r>
+          </w:p>
+        </w:tc>
+      </w:tr>
+      <w:tr>
+        <w:trPr>
+          <w:trHeight w:val="447"/>
+          <w:tblCellSpacing w:w="15" w:type="dxa"/>
+        </w:trPr>
+        <w:tc>
+          <w:tcPr>
+            <w:tcW w:w="0" w:type="auto"/>
+            <w:tcMar>
+              <w:top w:w="120" w:type="dxa"/>
+              <w:left w:w="180" w:type="dxa"/>
+              <w:bottom w:w="120" w:type="dxa"/>
+              <w:right w:w="180" w:type="dxa"/>
+            </w:tcMar>
+            <w:vAlign w:val="center"/>
+            <w:hideMark/>
+          </w:tcPr>
+          <w:p>
+            <w:r>
+              <w:rPr>
+                <w:b/>
+                <w:bCs/>
+              </w:rPr>
+              <w:t>M5</w:t>
+            </w:r>
+          </w:p>
+        </w:tc>
+        <w:tc>
+          <w:tcPr>
+            <w:tcW w:w="0" w:type="auto"/>
+            <w:tcMar>
+              <w:top w:w="120" w:type="dxa"/>
+              <w:left w:w="180" w:type="dxa"/>
+              <w:bottom w:w="120" w:type="dxa"/>
+              <w:right w:w="180" w:type="dxa"/>
+            </w:tcMar>
+            <w:vAlign w:val="center"/>
+            <w:hideMark/>
+          </w:tcPr>
+          <w:p>
+            <w:r>
+              <w:t xml:space="preserve">Charts &amp; </w:t>
+            </w:r>
+            <w:proofErr w:type="spellStart"/>
+            <w:r>
+              <w:t>Notifications</w:t>
+            </w:r>
+            <w:proofErr w:type="spellEnd"/>
+            <w:r>
+              <w:t xml:space="preserve"> (Extra-Konzepte)</w:t>
+            </w:r>
+          </w:p>
+        </w:tc>
+        <w:tc>
+          <w:tcPr>
+            <w:tcW w:w="0" w:type="auto"/>
+            <w:tcMar>
+              <w:top w:w="120" w:type="dxa"/>
+              <w:left w:w="180" w:type="dxa"/>
+              <w:bottom w:w="120" w:type="dxa"/>
+              <w:right w:w="180" w:type="dxa"/>
+            </w:tcMar>
+            <w:vAlign w:val="center"/>
+            <w:hideMark/>
+          </w:tcPr>
+          <w:p>
+            <w:r>
+              <w:t>10.03.2026</w:t>
+            </w:r>
+          </w:p>
+        </w:tc>
+      </w:tr>
+      <w:tr>
+        <w:trPr>
+          <w:trHeight w:val="447"/>
+          <w:tblCellSpacing w:w="15" w:type="dxa"/>
+        </w:trPr>
+        <w:tc>
+          <w:tcPr>
+            <w:tcW w:w="0" w:type="auto"/>
+            <w:tcMar>
+              <w:top w:w="120" w:type="dxa"/>
+              <w:left w:w="180" w:type="dxa"/>
+              <w:bottom w:w="120" w:type="dxa"/>
+              <w:right w:w="180" w:type="dxa"/>
+            </w:tcMar>
+            <w:vAlign w:val="center"/>
+            <w:hideMark/>
+          </w:tcPr>
+          <w:p>
+            <w:r>
+              <w:rPr>
+                <w:b/>
+                <w:bCs/>
+              </w:rPr>
+              <w:t>M6</w:t>
+            </w:r>
+          </w:p>
+        </w:tc>
+        <w:tc>
+          <w:tcPr>
+            <w:tcW w:w="0" w:type="auto"/>
+            <w:tcMar>
+              <w:top w:w="120" w:type="dxa"/>
+              <w:left w:w="180" w:type="dxa"/>
+              <w:bottom w:w="120" w:type="dxa"/>
+              <w:right w:w="180" w:type="dxa"/>
+            </w:tcMar>
+            <w:vAlign w:val="center"/>
+            <w:hideMark/>
+          </w:tcPr>
+          <w:p>
+            <w:r>
+              <w:t xml:space="preserve">Finales </w:t>
+            </w:r>
+            <w:proofErr w:type="spellStart"/>
+            <w:r>
+              <w:t>Testing</w:t>
+            </w:r>
+            <w:proofErr w:type="spellEnd"/>
+            <w:r>
+              <w:t xml:space="preserve"> &amp; Dokumentation</w:t>
+            </w:r>
+          </w:p>
+        </w:tc>
+        <w:tc>
+          <w:tcPr>
+            <w:tcW w:w="0" w:type="auto"/>
+            <w:tcMar>
+              <w:top w:w="120" w:type="dxa"/>
+              <w:left w:w="180" w:type="dxa"/>
+              <w:bottom w:w="120" w:type="dxa"/>
+              <w:right w:w="180" w:type="dxa"/>
+            </w:tcMar>
+            <w:vAlign w:val="center"/>
+            <w:hideMark/>
+          </w:tcPr>
+          <w:p>
+            <w:r>
+              <w:t>17.03.2026</w:t>
+            </w:r>
+          </w:p>
+        </w:tc>
+      </w:tr>
+    </w:tbl>
+    <w:p/>
+    <w:p/>
+    <w:p/>
+    <w:p/>
+    <w:p/>
+    <w:p/>
+    <w:p>
+      <w:pPr>
+        <w:rPr>
+          <w:b/>
+          <w:bCs/>
+          <w:sz w:val="24"/>
+          <w:szCs w:val="24"/>
+        </w:rPr>
+      </w:pPr>
+      <w:r>
+        <w:rPr>
+          <w:b/>
+          <w:bCs/>
+          <w:sz w:val="24"/>
+          <w:szCs w:val="24"/>
+        </w:rPr>
+        <w:t>5</w:t>
+      </w:r>
+      <w:r>
+        <w:rPr>
+          <w:b/>
+          <w:bCs/>
+          <w:sz w:val="24"/>
+          <w:szCs w:val="24"/>
+        </w:rPr>
+        <w:t xml:space="preserve">. Programmablauf </w:t>
+      </w:r>
+    </w:p>
+    <w:p>
+      <w:pPr>
+        <w:numPr>
+          <w:ilvl w:val="0"/>
+          <w:numId w:val="3"/>
+        </w:numPr>
+      </w:pPr>
+      <w:r>
+        <w:rPr>
+          <w:b/>
+          <w:bCs/>
+        </w:rPr>
+        <w:t>Start &amp; Dashboard:</w:t>
+      </w:r>
+      <w:r>
+        <w:t xml:space="preserve"> Die App öffnet sich mit dem zuletzt gewählten </w:t>
+      </w:r>
+      <w:proofErr w:type="spellStart"/>
+      <w:r>
+        <w:t>Theme</w:t>
+      </w:r>
+      <w:proofErr w:type="spellEnd"/>
+      <w:r>
+        <w:t>. Der Nutzer sieht sofort seine monatlichen Gesamtausgaben auf dem Dashboard.</w:t>
+      </w:r>
+    </w:p>
+    <w:p>
+      <w:pPr>
+        <w:numPr>
+          <w:ilvl w:val="0"/>
+          <w:numId w:val="3"/>
+        </w:numPr>
+      </w:pPr>
+      <w:r>
+        <w:rPr>
+          <w:b/>
+          <w:bCs/>
+        </w:rPr>
+        <w:t>Abo hinzufügen:</w:t>
+      </w:r>
+      <w:r>
+        <w:t xml:space="preserve"> Über einen Plus-Button gelangt der Nutzer zum Formular. Er gibt Name, Preis und Intervall ein. Nach dem Speichern kehrt er zum Dashboard zurück, das sich automatisch aktualisiert.</w:t>
+      </w:r>
+    </w:p>
+    <w:p>
+      <w:pPr>
+        <w:numPr>
+          <w:ilvl w:val="0"/>
+          <w:numId w:val="3"/>
+        </w:numPr>
+      </w:pPr>
+      <w:r>
+        <w:rPr>
+          <w:b/>
+          <w:bCs/>
+        </w:rPr>
+        <w:t>Ausgaben analysieren:</w:t>
+      </w:r>
+      <w:r>
+        <w:t xml:space="preserve"> Der Nutzer wechselt zum Statistik-Tab. Dort wird die Kostenverteilung in einem Diagramm visualisiert.</w:t>
+      </w:r>
+    </w:p>
+    <w:p>
+      <w:pPr>
+        <w:numPr>
+          <w:ilvl w:val="0"/>
+          <w:numId w:val="3"/>
+        </w:numPr>
+      </w:pPr>
+      <w:r>
+        <w:rPr>
+          <w:b/>
+          <w:bCs/>
+        </w:rPr>
+        <w:t>Verwalten:</w:t>
+      </w:r>
+      <w:r>
+        <w:t xml:space="preserve"> In der Listenansicht kann der Nutzer Details einsehen oder ein Abo per </w:t>
+      </w:r>
+      <w:proofErr w:type="spellStart"/>
+      <w:r>
+        <w:t>Swipe</w:t>
+      </w:r>
+      <w:proofErr w:type="spellEnd"/>
+      <w:r>
+        <w:t>-Geste und Bestätigungs-Dialog löschen.</w:t>
+      </w:r>
+    </w:p>
+    <w:p>
+      <w:pPr>
+        <w:numPr>
+          <w:ilvl w:val="0"/>
+          <w:numId w:val="3"/>
+        </w:numPr>
+      </w:pPr>
+      <w:r>
+        <w:rPr>
+          <w:b/>
+          <w:bCs/>
+        </w:rPr>
+        <w:t>Personalisieren:</w:t>
+      </w:r>
+      <w:r>
+        <w:t xml:space="preserve"> In den Einstellungen wählt der Nutzer eines von 5 </w:t>
+      </w:r>
+      <w:proofErr w:type="spellStart"/>
+      <w:r>
+        <w:t>Themes</w:t>
+      </w:r>
+      <w:proofErr w:type="spellEnd"/>
+      <w:r>
+        <w:t xml:space="preserve"> oder ändert die Währung. Diese Änderungen sind sofort aktiv und bleiben dauerhaft gespeichert.</w:t>
       </w:r>
     </w:p>
     <w:p/>
@@ -544,6 +1559,119 @@
 <file path=word/numbering.xml><?xml version="1.0" encoding="utf-8"?>
 <w:numbering xmlns:wpc="http://schemas.microsoft.com/office/word/2010/wordprocessingCanvas" xmlns:cx="http://schemas.microsoft.com/office/drawing/2014/chartex" xmlns:cx1="http://schemas.microsoft.com/office/drawing/2015/9/8/chartex" xmlns:cx2="http://schemas.microsoft.com/office/drawing/2015/10/21/chartex" xmlns:cx3="http://schemas.microsoft.com/office/drawing/2016/5/9/chartex" xmlns:cx4="http://schemas.microsoft.com/office/drawing/2016/5/10/chartex" xmlns:cx5="http://schemas.microsoft.com/office/drawing/2016/5/11/chartex" xmlns:cx6="http://schemas.microsoft.com/office/drawing/2016/5/12/chartex" xmlns:cx7="http://schemas.microsoft.com/office/drawing/2016/5/13/chartex" xmlns:cx8="http://schemas.microsoft.com/office/drawing/2016/5/14/chartex" xmlns:mc="http://schemas.openxmlformats.org/markup-compatibility/2006" xmlns:aink="http://schemas.microsoft.com/office/drawing/2016/ink" xmlns:am3d="http://schemas.microsoft.com/office/drawing/2017/model3d" xmlns:o="urn:schemas-microsoft-com:office:office" xmlns:oel="http://schemas.microsoft.com/office/2019/extlst" xmlns:r="http://schemas.openxmlformats.org/officeDocument/2006/relationships" xmlns:m="http://schemas.openxmlformats.org/officeDocument/2006/math" xmlns:v="urn:schemas-microsoft-com:vml" xmlns:wp14="http://schemas.microsoft.com/office/word/2010/wordprocessingDrawing" xmlns:wp="http://schemas.openxmlformats.org/drawingml/2006/wordprocessingDrawing" xmlns:w10="urn:schemas-microsoft-com:office:word" xmlns:w="http://schemas.openxmlformats.org/wordprocessingml/2006/main" xmlns:w14="http://schemas.microsoft.com/office/word/2010/wordml" xmlns:w15="http://schemas.microsoft.com/office/word/2012/wordml" xmlns:w16cex="http://schemas.microsoft.com/office/word/2018/wordml/cex" xmlns:w16cid="http://schemas.microsoft.com/office/word/2016/wordml/cid" xmlns:w16="http://schemas.microsoft.com/office/word/2018/wordml" xmlns:w16du="http://schemas.microsoft.com/office/word/2023/wordml/word16du" xmlns:w16sdtdh="http://schemas.microsoft.com/office/word/2020/wordml/sdtdatahash" xmlns:w16sdtfl="http://schemas.microsoft.com/office/word/2024/wordml/sdtformatlock" xmlns:w16se="http://schemas.microsoft.com/office/word/2015/wordml/symex" xmlns:wpg="http://schemas.microsoft.com/office/word/2010/wordprocessingGroup" xmlns:wpi="http://schemas.microsoft.com/office/word/2010/wordprocessingInk" xmlns:wne="http://schemas.microsoft.com/office/word/2006/wordml" xmlns:wps="http://schemas.microsoft.com/office/word/2010/wordprocessingShape" mc:Ignorable="w14 w15 w16se w16cid w16 w16cex w16sdtdh w16sdtfl w16du wp14">
   <w:abstractNum w:abstractNumId="0" w15:restartNumberingAfterBreak="0">
+    <w:nsid w:val="13F84BA0"/>
+    <w:multiLevelType w:val="multilevel"/>
+    <w:tmpl w:val="E6A6FDC8"/>
+    <w:lvl w:ilvl="0">
+      <w:start w:val="1"/>
+      <w:numFmt w:val="decimal"/>
+      <w:lvlText w:val="%1."/>
+      <w:lvlJc w:val="left"/>
+      <w:pPr>
+        <w:tabs>
+          <w:tab w:val="num" w:pos="720"/>
+        </w:tabs>
+        <w:ind w:left="720" w:hanging="360"/>
+      </w:pPr>
+    </w:lvl>
+    <w:lvl w:ilvl="1" w:tentative="1">
+      <w:start w:val="1"/>
+      <w:numFmt w:val="decimal"/>
+      <w:lvlText w:val="%2."/>
+      <w:lvlJc w:val="left"/>
+      <w:pPr>
+        <w:tabs>
+          <w:tab w:val="num" w:pos="1440"/>
+        </w:tabs>
+        <w:ind w:left="1440" w:hanging="360"/>
+      </w:pPr>
+    </w:lvl>
+    <w:lvl w:ilvl="2" w:tentative="1">
+      <w:start w:val="1"/>
+      <w:numFmt w:val="decimal"/>
+      <w:lvlText w:val="%3."/>
+      <w:lvlJc w:val="left"/>
+      <w:pPr>
+        <w:tabs>
+          <w:tab w:val="num" w:pos="2160"/>
+        </w:tabs>
+        <w:ind w:left="2160" w:hanging="360"/>
+      </w:pPr>
+    </w:lvl>
+    <w:lvl w:ilvl="3" w:tentative="1">
+      <w:start w:val="1"/>
+      <w:numFmt w:val="decimal"/>
+      <w:lvlText w:val="%4."/>
+      <w:lvlJc w:val="left"/>
+      <w:pPr>
+        <w:tabs>
+          <w:tab w:val="num" w:pos="2880"/>
+        </w:tabs>
+        <w:ind w:left="2880" w:hanging="360"/>
+      </w:pPr>
+    </w:lvl>
+    <w:lvl w:ilvl="4" w:tentative="1">
+      <w:start w:val="1"/>
+      <w:numFmt w:val="decimal"/>
+      <w:lvlText w:val="%5."/>
+      <w:lvlJc w:val="left"/>
+      <w:pPr>
+        <w:tabs>
+          <w:tab w:val="num" w:pos="3600"/>
+        </w:tabs>
+        <w:ind w:left="3600" w:hanging="360"/>
+      </w:pPr>
+    </w:lvl>
+    <w:lvl w:ilvl="5" w:tentative="1">
+      <w:start w:val="1"/>
+      <w:numFmt w:val="decimal"/>
+      <w:lvlText w:val="%6."/>
+      <w:lvlJc w:val="left"/>
+      <w:pPr>
+        <w:tabs>
+          <w:tab w:val="num" w:pos="4320"/>
+        </w:tabs>
+        <w:ind w:left="4320" w:hanging="360"/>
+      </w:pPr>
+    </w:lvl>
+    <w:lvl w:ilvl="6" w:tentative="1">
+      <w:start w:val="1"/>
+      <w:numFmt w:val="decimal"/>
+      <w:lvlText w:val="%7."/>
+      <w:lvlJc w:val="left"/>
+      <w:pPr>
+        <w:tabs>
+          <w:tab w:val="num" w:pos="5040"/>
+        </w:tabs>
+        <w:ind w:left="5040" w:hanging="360"/>
+      </w:pPr>
+    </w:lvl>
+    <w:lvl w:ilvl="7" w:tentative="1">
+      <w:start w:val="1"/>
+      <w:numFmt w:val="decimal"/>
+      <w:lvlText w:val="%8."/>
+      <w:lvlJc w:val="left"/>
+      <w:pPr>
+        <w:tabs>
+          <w:tab w:val="num" w:pos="5760"/>
+        </w:tabs>
+        <w:ind w:left="5760" w:hanging="360"/>
+      </w:pPr>
+    </w:lvl>
+    <w:lvl w:ilvl="8" w:tentative="1">
+      <w:start w:val="1"/>
+      <w:numFmt w:val="decimal"/>
+      <w:lvlText w:val="%9."/>
+      <w:lvlJc w:val="left"/>
+      <w:pPr>
+        <w:tabs>
+          <w:tab w:val="num" w:pos="6480"/>
+        </w:tabs>
+        <w:ind w:left="6480" w:hanging="360"/>
+      </w:pPr>
+    </w:lvl>
+  </w:abstractNum>
+  <w:abstractNum w:abstractNumId="1" w15:restartNumberingAfterBreak="0">
     <w:nsid w:val="420C1098"/>
     <w:multiLevelType w:val="multilevel"/>
     <w:tmpl w:val="AEB4E3D6"/>
@@ -692,7 +1820,7 @@
       </w:rPr>
     </w:lvl>
   </w:abstractNum>
-  <w:abstractNum w:abstractNumId="1" w15:restartNumberingAfterBreak="0">
+  <w:abstractNum w:abstractNumId="2" w15:restartNumberingAfterBreak="0">
     <w:nsid w:val="48674D2F"/>
     <w:multiLevelType w:val="multilevel"/>
     <w:tmpl w:val="B3CC4CC2"/>
@@ -842,9 +1970,12 @@
     </w:lvl>
   </w:abstractNum>
   <w:num w:numId="1" w16cid:durableId="309291708">
+    <w:abstractNumId w:val="2"/>
+  </w:num>
+  <w:num w:numId="2" w16cid:durableId="432943856">
     <w:abstractNumId w:val="1"/>
   </w:num>
-  <w:num w:numId="2" w16cid:durableId="432943856">
+  <w:num w:numId="3" w16cid:durableId="1415936486">
     <w:abstractNumId w:val="0"/>
   </w:num>
 </w:numbering>
@@ -1453,6 +2584,7 @@
   <w:style w:type="character" w:default="1" w:styleId="Absatz-Standardschriftart">
     <w:name w:val="Default Paragraph Font"/>
     <w:uiPriority w:val="1"/>
+    <w:semiHidden/>
     <w:unhideWhenUsed/>
   </w:style>
   <w:style w:type="table" w:default="1" w:styleId="NormaleTabelle">

</xml_diff>